<commit_message>
Clarify current pipeline terminology and consolidate program PR record
</commit_message>
<xml_diff>
--- a/lens_program/2_LENS_Objectives_Course_Mapping.docx
+++ b/lens_program/2_LENS_Objectives_Course_Mapping.docx
@@ -2,6 +2,45 @@
 <file path=word/document.xml><?xml version="1.0" encoding="utf-8"?>
 <w:document xmlns:w="http://schemas.openxmlformats.org/wordprocessingml/2006/main" xmlns:m="http://schemas.openxmlformats.org/officeDocument/2006/math" xmlns:r="http://schemas.openxmlformats.org/officeDocument/2006/relationships" xmlns:o="urn:schemas-microsoft-com:office:office" xmlns:v="urn:schemas-microsoft-com:vml" xmlns:w10="urn:schemas-microsoft-com:office:word" xmlns:a="http://schemas.openxmlformats.org/drawingml/2006/main" xmlns:pic="http://schemas.openxmlformats.org/drawingml/2006/picture" xmlns:wp="http://schemas.openxmlformats.org/drawingml/2006/wordprocessingDrawing">
   <w:body>
+    <w:p>
+      <w:pPr>
+        <w:pStyle w:val="BlockText"/>
+      </w:pPr>
+      <w:r>
+        <w:rPr>
+          <w:bCs/>
+          <w:b/>
+        </w:rPr>
+        <w:t>Course-owner wording clarification — October 19, 2026: Map is the second stage and Experiment is the sixth. Follow Understand → Map → Design → Build → Instrument → Experiment → Evaluate → Understand, with 8. Refine throughout. Deployment connects the resulting capability back to the challenge. These terminology and diagram clarifications preserve the objective hierarchy and mappings; they do not assert new CPC or program-director approval. Historical status notes and change logs retain their original wording.</w:t>
+      </w:r>
+      <w:r/>
+      <w:r/>
+      <w:r/>
+      <w:r/>
+      <w:r>
+        <w:rPr>
+          <w:bCs/>
+          <w:b/>
+        </w:rPr>
+      </w:r>
+      <w:r/>
+      <w:r/>
+      <w:r/>
+      <w:r/>
+      <w:r/>
+      <w:r/>
+      <w:r/>
+      <w:r/>
+      <w:r>
+        <w:rPr>
+          <w:bCs/>
+          <w:b/>
+        </w:rPr>
+      </w:r>
+      <w:r/>
+      <w:r/>
+      <w:r/>
+    </w:p>
     <w:p>
       <w:pPr>
         <w:pStyle w:val="BlockText"/>
@@ -1882,55 +1921,55 @@
         <w:pStyle w:val="FirstParagraph"/>
       </w:pPr>
       <w:r>
-        <w:t xml:space="preserve">Design capability development interventions through iterative engineering cycles (understand, model, design, build, instrument, deploy, evaluate, refine, where refine returns to understand to re-frame the problem rather than only tune the intervention) that integrate learning sciences principles with measurable outcomes and system design constraints, and that function at speed and scale within operational environments. Evaluate the operational impact of evidence-based design strategies for transfer to high-consequence settings. Construct and communicate implementation plans that address adoption, sustainment, and lifecycle integration across organizational and system boundaries.</w:t>
-      </w:r>
-      <w:r>
-        <w:t xml:space="preserve"> </w:t>
+        <w:t xml:space="preserve">Design capability development interventions through iterative engineering cycles (understand, map, design, build, instrument, experiment, evaluate, then return to understand; refine throughout) that integrate learning sciences principles with measurable outcomes and system design constraints, and that function at speed and scale within operational environments. Evaluate the operational impact of evidence-based design strategies for transfer to high-consequence settings. Construct and communicate implementation plans that address adoption, sustainment, and lifecycle integration across organizational and system boundaries. [v2] Narrate and defend the design iteration in first person; design competence includes rendering iteration legible, not only producing an outcome. [v2.3] Enable the people who deliver: design the human support layer — job aids, point-of-need performance support, train-the-trainer provisions — so the intervention can be delivered without the designer present, treating the deliverer as a designed-for user rather than a channel. [v2.5] Design for accessibility and inclusion: design so the intervention is usable by the range of learners it will actually meet, and test for accessibility and inclusion rather than usability alone, recognizing where a design assumes a learner who will not be there.</w:t>
+      </w:r>
+      <w:r>
+        <w:t xml:space="preserve"/>
       </w:r>
       <w:r>
         <w:rPr>
           <w:iCs/>
           <w:i/>
         </w:rPr>
-        <w:t xml:space="preserve">[v2]</w:t>
-      </w:r>
-      <w:r>
-        <w:t xml:space="preserve"> </w:t>
-      </w:r>
-      <w:r>
-        <w:t xml:space="preserve">Narrate and defend the design iteration in first person; design competence includes rendering iteration legible, not only producing an outcome.</w:t>
-      </w:r>
-      <w:r>
-        <w:t xml:space="preserve"> </w:t>
+        <w:t xml:space="preserve"/>
+      </w:r>
+      <w:r>
+        <w:t xml:space="preserve"/>
+      </w:r>
+      <w:r>
+        <w:t xml:space="preserve"/>
+      </w:r>
+      <w:r>
+        <w:t xml:space="preserve"/>
       </w:r>
       <w:r>
         <w:rPr>
           <w:iCs/>
           <w:i/>
         </w:rPr>
-        <w:t xml:space="preserve">[v2.3]</w:t>
-      </w:r>
-      <w:r>
-        <w:t xml:space="preserve"> </w:t>
-      </w:r>
-      <w:r>
-        <w:t xml:space="preserve">Enable the people who deliver: design the human support layer — job aids, point-of-need performance support, train-the-trainer provisions — so the intervention can be delivered without the designer present, treating the deliverer as a designed-for user rather than a channel.</w:t>
-      </w:r>
-      <w:r>
-        <w:t xml:space="preserve"> </w:t>
+        <w:t xml:space="preserve"/>
+      </w:r>
+      <w:r>
+        <w:t xml:space="preserve"/>
+      </w:r>
+      <w:r>
+        <w:t xml:space="preserve"/>
+      </w:r>
+      <w:r>
+        <w:t xml:space="preserve"/>
       </w:r>
       <w:r>
         <w:rPr>
           <w:iCs/>
           <w:i/>
         </w:rPr>
-        <w:t xml:space="preserve">[v2.5]</w:t>
-      </w:r>
-      <w:r>
-        <w:t xml:space="preserve"> </w:t>
-      </w:r>
-      <w:r>
-        <w:t xml:space="preserve">Design for accessibility and inclusion: design so the intervention is usable by the range of learners it will actually meet, and test for accessibility and inclusion rather than usability alone, recognizing where a design assumes a learner who will not be there.</w:t>
+        <w:t xml:space="preserve"/>
+      </w:r>
+      <w:r>
+        <w:t xml:space="preserve"/>
+      </w:r>
+      <w:r>
+        <w:t xml:space="preserve"/>
       </w:r>
     </w:p>
     <w:bookmarkEnd w:id="24"/>
@@ -3135,7 +3174,7 @@
         <w:pStyle w:val="BodyText"/>
       </w:pPr>
       <w:r>
-        <w:t xml:space="preserve">First course in the LENS concentration sequence. Establishes the intellectual and methodological principles of learning engineering as a systems-level discipline. Introduces capability as the interface between what a system requires of its human operators and the impact of that system, and frames the engineering of this interface as the central problem of the field. Examines the convergence of learning sciences, human systems integration, and systems engineering when human capability is treated as a design problem within and across disparate systems. Core topics: defining measurable capability requirements; systems lifecycle thinking; system integration and interdependencies; the iterative engineering cycle (understand, model, design, build, instrument, deploy, evaluate, refine) as the field’s core method; the evidence-capability-performance flywheel (faster evidence cycles accelerate capability development at speed and scale); ethics of intervention where human and system performance are interdependent. Introduces the professional dispositions of the field: focus on learning and learners, reflective and iterative practice, responsiveness to evidence, systems thinking, and mindfulness of context. Students practice communicating capability analyses to diverse stakeholders.</w:t>
+        <w:t xml:space="preserve">First course in the LENS concentration sequence. Establishes the intellectual and methodological principles of learning engineering as a systems-level discipline. Introduces capability as the interface between what a system requires of its human operators and the impact of that system, and frames the engineering of this interface as the central problem of the field. Examines the convergence of learning sciences, human systems integration, and systems engineering when human capability is treated as a design problem within and across disparate systems. Core topics: defining measurable capability requirements; systems lifecycle thinking; system integration and interdependencies; the iterative engineering cycle (understand, map, design, build, instrument, experiment, evaluate, then return to understand; refine throughout) as the field’s core method; the evidence-capability-performance flywheel (faster evidence cycles accelerate capability development at speed and scale); ethics of intervention where human and system performance are interdependent. Introduces the professional dispositions of the field: focus on learning and learners, reflective and iterative practice, responsiveness to evidence, systems thinking, and mindfulness of context. Students practice communicating capability analyses to diverse stakeholders.</w:t>
       </w:r>
     </w:p>
     <w:tbl>
@@ -3656,23 +3695,23 @@
         <w:pStyle w:val="BodyText"/>
       </w:pPr>
       <w:r>
-        <w:t xml:space="preserve">End-to-end learning engineering project in a real organizational context. Students identify a capability development challenge at a partner organization (APL as founding partner pathway), gather measurable evidence, design and evaluate an intervention, and assess operational impact. Projects must document at least one complete iteration cycle (understand, model, design, build, instrument, deploy, evaluate, refine) in the reproducible report. Students are encouraged to site their project in a domain where they hold prior expertise, using that fluency to engage organizational experts credibly while practicing the boundary-crossing communication the field requires. Projects address system integration, speed, and scalability considerations appropriate to the partner context, accounting for the total cost of ownership across the solution’s life rather than the build cost alone (deepened in LEN 8). The system model specifies the human-system boundary in the project context: who holds which role, how authority is allocated across the boundary, and what recovers the system when the collaboration fails. The instrumentation plan states and defends its unit of analysis, carrying at least one collaboration-level measure or an argument that the individual operator is the correct unit for the context. Students manage the project itself — plan, budget, timeline, resources, versioning, and progress reporting to the partner — so that project and program management is exercised and evidenced in the capstone rather than taught as a separate domain (this is where the field framework’s</w:t>
-      </w:r>
-      <w:r>
-        <w:t xml:space="preserve"> </w:t>
+        <w:t xml:space="preserve">End-to-end learning engineering project in a real organizational context. Students identify a capability development challenge at a partner organization (APL as founding partner pathway), gather measurable evidence, design and evaluate an intervention, and assess operational impact. Projects must document at least one complete iteration cycle (understand, map, design, build, instrument, experiment, evaluate, then return to understand; refine throughout) in the reproducible report. Students are encouraged to site their project in a domain where they hold prior expertise, using that fluency to engage organizational experts credibly while practicing the boundary-crossing communication the field requires. Projects address system integration, speed, and scalability considerations appropriate to the partner context, accounting for the total cost of ownership across the solution’s life rather than the build cost alone (deepened in LEN 8). The system model specifies the human-system boundary in the project context: who holds which role, how authority is allocated across the boundary, and what recovers the system when the collaboration fails. The instrumentation plan states and defends its unit of analysis, carrying at least one collaboration-level measure or an argument that the individual operator is the correct unit for the context. Students manage the project itself — plan, budget, timeline, resources, versioning, and progress reporting to the partner — so that project and program management is exercised and evidenced in the capstone rather than taught as a separate domain (this is where the field framework’s manage the work competency is met). The sustainment plan designs the delivery and support layer so the intervention outlives the engagement without depending on its designer (subobjective 2.6), and the role architecture accounts for the people who deliver it (subobjective 3.7). Integrates all five competency domains, each assessed rather than asserted. Signature deliverables communicate findings to multiple audiences: evidence dashboard, reproducible report, and governance/ethics plan. Portfolio-quality standards required.</w:t>
+      </w:r>
+      <w:r>
+        <w:t xml:space="preserve"/>
       </w:r>
       <w:r>
         <w:rPr>
           <w:iCs/>
           <w:i/>
         </w:rPr>
-        <w:t xml:space="preserve">manage the work</w:t>
-      </w:r>
-      <w:r>
-        <w:t xml:space="preserve"> </w:t>
-      </w:r>
-      <w:r>
-        <w:t xml:space="preserve">competency is met). The sustainment plan designs the delivery and support layer so the intervention outlives the engagement without depending on its designer (subobjective 2.6), and the role architecture accounts for the people who deliver it (subobjective 3.7). Integrates all five competency domains, each assessed rather than asserted. Signature deliverables communicate findings to multiple audiences: evidence dashboard, reproducible report, and governance/ethics plan. Portfolio-quality standards required.</w:t>
+        <w:t xml:space="preserve"/>
+      </w:r>
+      <w:r>
+        <w:t xml:space="preserve"/>
+      </w:r>
+      <w:r>
+        <w:t xml:space="preserve"/>
       </w:r>
     </w:p>
     <w:tbl>

</xml_diff>